<commit_message>
Update Resume and Cover Letter
</commit_message>
<xml_diff>
--- a/documents/Michael Wester.docx
+++ b/documents/Michael Wester.docx
@@ -44,7 +44,7 @@
               <w:rPr>
                 <w:rFonts w:asciiTheme="majorHAnsi" w:hAnsiTheme="majorHAnsi" w:cstheme="majorHAnsi"/>
               </w:rPr>
-              <w:t>Grafton</w:t>
+              <w:t>Milwaukee</w:t>
             </w:r>
             <w:r>
               <w:rPr>
@@ -233,8 +233,6 @@
         </w:rPr>
         <w:t>Work Experience</w:t>
       </w:r>
-      <w:bookmarkStart w:id="0" w:name="_5jnocwoa0dvd" w:colFirst="0" w:colLast="0"/>
-      <w:bookmarkEnd w:id="0"/>
     </w:p>
     <w:p>
       <w:pPr>
@@ -249,59 +247,16 @@
           <w:tab w:val="left" w:pos="2160"/>
         </w:tabs>
         <w:rPr>
-          <w:rFonts w:asciiTheme="majorHAnsi" w:hAnsiTheme="majorHAnsi" w:cstheme="majorHAnsi"/>
-          <w:b/>
-        </w:rPr>
-      </w:pPr>
-      <w:r>
-        <w:rPr>
           <w:rFonts w:asciiTheme="minorHAnsi" w:eastAsia="Calibri" w:hAnsiTheme="minorHAnsi" w:cstheme="minorHAnsi"/>
           <w:bCs/>
         </w:rPr>
-        <w:t>Software Engineering Team Lead</w:t>
-      </w:r>
-      <w:r>
-        <w:rPr>
-          <w:rFonts w:asciiTheme="majorHAnsi" w:hAnsiTheme="majorHAnsi" w:cstheme="majorHAnsi"/>
-          <w:b/>
-        </w:rPr>
-        <w:tab/>
-      </w:r>
-      <w:proofErr w:type="gramStart"/>
-      <w:r>
-        <w:rPr>
-          <w:rFonts w:asciiTheme="majorHAnsi" w:hAnsiTheme="majorHAnsi" w:cstheme="majorHAnsi"/>
-          <w:b/>
-        </w:rPr>
-        <w:t>The</w:t>
-      </w:r>
-      <w:proofErr w:type="gramEnd"/>
-      <w:r>
-        <w:rPr>
-          <w:rFonts w:asciiTheme="majorHAnsi" w:hAnsiTheme="majorHAnsi" w:cstheme="majorHAnsi"/>
-          <w:b/>
-        </w:rPr>
-        <w:t xml:space="preserve"> Predictive Index</w:t>
-      </w:r>
-      <w:r>
-        <w:rPr>
-          <w:rFonts w:asciiTheme="majorHAnsi" w:hAnsiTheme="majorHAnsi" w:cstheme="majorHAnsi"/>
-        </w:rPr>
-        <w:tab/>
-      </w:r>
-      <w:r>
-        <w:rPr>
-          <w:rFonts w:asciiTheme="majorHAnsi" w:hAnsiTheme="majorHAnsi" w:cstheme="majorHAnsi"/>
-          <w:b/>
-        </w:rPr>
-        <w:t>Oct 2021 – Nov 2022</w:t>
-      </w:r>
-    </w:p>
-    <w:p>
-      <w:pPr>
-        <w:tabs>
+      </w:pPr>
+    </w:p>
+    <w:p>
+      <w:pPr>
+        <w:tabs>
+          <w:tab w:val="left" w:pos="720"/>
           <w:tab w:val="left" w:pos="-1007"/>
-          <w:tab w:val="left" w:pos="720"/>
           <w:tab w:val="left" w:pos="4395"/>
           <w:tab w:val="right" w:pos="10197"/>
           <w:tab w:val="center" w:pos="5097"/>
@@ -311,6 +266,67 @@
         </w:tabs>
         <w:rPr>
           <w:rFonts w:asciiTheme="majorHAnsi" w:hAnsiTheme="majorHAnsi" w:cstheme="majorHAnsi"/>
+          <w:b/>
+        </w:rPr>
+      </w:pPr>
+      <w:r>
+        <w:rPr>
+          <w:rFonts w:asciiTheme="minorHAnsi" w:eastAsia="Calibri" w:hAnsiTheme="minorHAnsi" w:cstheme="minorHAnsi"/>
+          <w:bCs/>
+        </w:rPr>
+        <w:t>Software Engineering Team Lead</w:t>
+      </w:r>
+      <w:r>
+        <w:rPr>
+          <w:rFonts w:asciiTheme="majorHAnsi" w:hAnsiTheme="majorHAnsi" w:cstheme="majorHAnsi"/>
+          <w:b/>
+        </w:rPr>
+        <w:tab/>
+      </w:r>
+      <w:proofErr w:type="gramStart"/>
+      <w:r>
+        <w:rPr>
+          <w:rFonts w:asciiTheme="majorHAnsi" w:hAnsiTheme="majorHAnsi" w:cstheme="majorHAnsi"/>
+          <w:b/>
+        </w:rPr>
+        <w:t>The</w:t>
+      </w:r>
+      <w:proofErr w:type="gramEnd"/>
+      <w:r>
+        <w:rPr>
+          <w:rFonts w:asciiTheme="majorHAnsi" w:hAnsiTheme="majorHAnsi" w:cstheme="majorHAnsi"/>
+          <w:b/>
+        </w:rPr>
+        <w:t xml:space="preserve"> Predictive Index</w:t>
+      </w:r>
+      <w:r>
+        <w:rPr>
+          <w:rFonts w:asciiTheme="majorHAnsi" w:hAnsiTheme="majorHAnsi" w:cstheme="majorHAnsi"/>
+        </w:rPr>
+        <w:tab/>
+      </w:r>
+      <w:r>
+        <w:rPr>
+          <w:rFonts w:asciiTheme="majorHAnsi" w:hAnsiTheme="majorHAnsi" w:cstheme="majorHAnsi"/>
+          <w:b/>
+        </w:rPr>
+        <w:t>Oct 2021 – Nov 2022</w:t>
+      </w:r>
+    </w:p>
+    <w:p>
+      <w:pPr>
+        <w:tabs>
+          <w:tab w:val="left" w:pos="720"/>
+          <w:tab w:val="left" w:pos="-1007"/>
+          <w:tab w:val="left" w:pos="4395"/>
+          <w:tab w:val="right" w:pos="10197"/>
+          <w:tab w:val="center" w:pos="5097"/>
+          <w:tab w:val="left" w:pos="720"/>
+          <w:tab w:val="left" w:pos="1440"/>
+          <w:tab w:val="left" w:pos="2160"/>
+        </w:tabs>
+        <w:rPr>
+          <w:rFonts w:asciiTheme="majorHAnsi" w:hAnsiTheme="majorHAnsi" w:cstheme="majorHAnsi"/>
           <w:sz w:val="22"/>
           <w:szCs w:val="22"/>
         </w:rPr>
@@ -348,6 +364,20 @@
         </w:rPr>
         <w:t>, WI</w:t>
       </w:r>
+    </w:p>
+    <w:p>
+      <w:pPr>
+        <w:tabs>
+          <w:tab w:val="left" w:pos="720"/>
+          <w:tab w:val="left" w:pos="1440"/>
+          <w:tab w:val="left" w:pos="2160"/>
+        </w:tabs>
+        <w:rPr>
+          <w:rFonts w:asciiTheme="majorHAnsi" w:hAnsiTheme="majorHAnsi" w:cstheme="majorHAnsi"/>
+          <w:sz w:val="22"/>
+          <w:szCs w:val="22"/>
+        </w:rPr>
+      </w:pPr>
     </w:p>
     <w:p>
       <w:pPr>
@@ -552,8 +582,8 @@
     <w:p>
       <w:pPr>
         <w:tabs>
+          <w:tab w:val="left" w:pos="720"/>
           <w:tab w:val="left" w:pos="-1007"/>
-          <w:tab w:val="left" w:pos="720"/>
           <w:tab w:val="left" w:pos="4395"/>
           <w:tab w:val="right" w:pos="10197"/>
           <w:tab w:val="center" w:pos="5097"/>
@@ -592,6 +622,20 @@
         <w:tab/>
         <w:t>Greater Milwaukee Area, WI</w:t>
       </w:r>
+    </w:p>
+    <w:p>
+      <w:pPr>
+        <w:tabs>
+          <w:tab w:val="left" w:pos="720"/>
+          <w:tab w:val="left" w:pos="1440"/>
+          <w:tab w:val="left" w:pos="2160"/>
+        </w:tabs>
+        <w:rPr>
+          <w:rFonts w:asciiTheme="majorHAnsi" w:hAnsiTheme="majorHAnsi" w:cstheme="majorHAnsi"/>
+          <w:sz w:val="22"/>
+          <w:szCs w:val="22"/>
+        </w:rPr>
+      </w:pPr>
     </w:p>
     <w:p>
       <w:pPr>
@@ -796,8 +840,8 @@
     <w:p>
       <w:pPr>
         <w:tabs>
+          <w:tab w:val="left" w:pos="720"/>
           <w:tab w:val="left" w:pos="-1007"/>
-          <w:tab w:val="left" w:pos="720"/>
           <w:tab w:val="left" w:pos="4395"/>
           <w:tab w:val="right" w:pos="10197"/>
           <w:tab w:val="center" w:pos="5097"/>
@@ -836,6 +880,20 @@
         <w:tab/>
         <w:t>Greater Milwaukee Area, WI</w:t>
       </w:r>
+    </w:p>
+    <w:p>
+      <w:pPr>
+        <w:tabs>
+          <w:tab w:val="left" w:pos="720"/>
+          <w:tab w:val="left" w:pos="1440"/>
+          <w:tab w:val="left" w:pos="2160"/>
+        </w:tabs>
+        <w:rPr>
+          <w:rFonts w:asciiTheme="majorHAnsi" w:hAnsiTheme="majorHAnsi" w:cstheme="majorHAnsi"/>
+          <w:sz w:val="22"/>
+          <w:szCs w:val="22"/>
+        </w:rPr>
+      </w:pPr>
     </w:p>
     <w:p>
       <w:pPr>
@@ -995,8 +1053,8 @@
     <w:p>
       <w:pPr>
         <w:tabs>
+          <w:tab w:val="left" w:pos="720"/>
           <w:tab w:val="left" w:pos="-1007"/>
-          <w:tab w:val="left" w:pos="720"/>
           <w:tab w:val="left" w:pos="4395"/>
           <w:tab w:val="right" w:pos="10197"/>
           <w:tab w:val="center" w:pos="5097"/>
@@ -1035,6 +1093,20 @@
         <w:tab/>
         <w:t>Greater Milwaukee Area, WI</w:t>
       </w:r>
+    </w:p>
+    <w:p>
+      <w:pPr>
+        <w:tabs>
+          <w:tab w:val="left" w:pos="720"/>
+          <w:tab w:val="left" w:pos="1440"/>
+          <w:tab w:val="left" w:pos="2160"/>
+        </w:tabs>
+        <w:rPr>
+          <w:rFonts w:asciiTheme="majorHAnsi" w:hAnsiTheme="majorHAnsi" w:cstheme="majorHAnsi"/>
+          <w:sz w:val="22"/>
+          <w:szCs w:val="22"/>
+        </w:rPr>
+      </w:pPr>
     </w:p>
     <w:p>
       <w:pPr>
@@ -1153,20 +1225,6 @@
       <w:pPr>
         <w:tabs>
           <w:tab w:val="left" w:pos="720"/>
-          <w:tab w:val="left" w:pos="1440"/>
-          <w:tab w:val="left" w:pos="2160"/>
-        </w:tabs>
-        <w:rPr>
-          <w:rFonts w:asciiTheme="majorHAnsi" w:hAnsiTheme="majorHAnsi" w:cstheme="majorHAnsi"/>
-          <w:sz w:val="22"/>
-          <w:szCs w:val="22"/>
-        </w:rPr>
-      </w:pPr>
-    </w:p>
-    <w:p>
-      <w:pPr>
-        <w:tabs>
-          <w:tab w:val="left" w:pos="720"/>
           <w:tab w:val="left" w:pos="-1007"/>
           <w:tab w:val="left" w:pos="4395"/>
           <w:tab w:val="right" w:pos="10197"/>
@@ -1177,49 +1235,16 @@
         </w:tabs>
         <w:rPr>
           <w:rFonts w:asciiTheme="majorHAnsi" w:hAnsiTheme="majorHAnsi" w:cstheme="majorHAnsi"/>
-          <w:b/>
-        </w:rPr>
-      </w:pPr>
-      <w:r>
-        <w:rPr>
-          <w:rFonts w:asciiTheme="minorHAnsi" w:eastAsia="Calibri" w:hAnsiTheme="minorHAnsi" w:cstheme="minorHAnsi"/>
-          <w:bCs/>
-        </w:rPr>
-        <w:t>Senior Software Engineer</w:t>
-      </w:r>
-      <w:r>
-        <w:rPr>
-          <w:rFonts w:asciiTheme="majorHAnsi" w:hAnsiTheme="majorHAnsi" w:cstheme="majorHAnsi"/>
-          <w:b/>
-        </w:rPr>
-        <w:tab/>
-      </w:r>
-      <w:r>
-        <w:rPr>
-          <w:rFonts w:asciiTheme="majorHAnsi" w:hAnsiTheme="majorHAnsi" w:cstheme="majorHAnsi"/>
-          <w:b/>
-        </w:rPr>
-        <w:t>Blue Yonder</w:t>
-      </w:r>
-      <w:r>
-        <w:rPr>
-          <w:rFonts w:asciiTheme="majorHAnsi" w:hAnsiTheme="majorHAnsi" w:cstheme="majorHAnsi"/>
-        </w:rPr>
-        <w:tab/>
-      </w:r>
-      <w:r>
-        <w:rPr>
-          <w:rFonts w:asciiTheme="majorHAnsi" w:hAnsiTheme="majorHAnsi" w:cstheme="majorHAnsi"/>
-          <w:b/>
-        </w:rPr>
-        <w:t>May 2015 – Mar 2016</w:t>
-      </w:r>
-    </w:p>
-    <w:p>
-      <w:pPr>
-        <w:tabs>
+          <w:sz w:val="22"/>
+          <w:szCs w:val="22"/>
+        </w:rPr>
+      </w:pPr>
+    </w:p>
+    <w:p>
+      <w:pPr>
+        <w:tabs>
+          <w:tab w:val="left" w:pos="720"/>
           <w:tab w:val="left" w:pos="-1007"/>
-          <w:tab w:val="left" w:pos="720"/>
           <w:tab w:val="left" w:pos="4395"/>
           <w:tab w:val="right" w:pos="10197"/>
           <w:tab w:val="center" w:pos="5097"/>
@@ -1229,6 +1254,58 @@
         </w:tabs>
         <w:rPr>
           <w:rFonts w:asciiTheme="majorHAnsi" w:hAnsiTheme="majorHAnsi" w:cstheme="majorHAnsi"/>
+          <w:b/>
+        </w:rPr>
+      </w:pPr>
+      <w:r>
+        <w:rPr>
+          <w:rFonts w:asciiTheme="minorHAnsi" w:eastAsia="Calibri" w:hAnsiTheme="minorHAnsi" w:cstheme="minorHAnsi"/>
+          <w:bCs/>
+        </w:rPr>
+        <w:t>Senior Software Engineer</w:t>
+      </w:r>
+      <w:r>
+        <w:rPr>
+          <w:rFonts w:asciiTheme="majorHAnsi" w:hAnsiTheme="majorHAnsi" w:cstheme="majorHAnsi"/>
+          <w:b/>
+        </w:rPr>
+        <w:tab/>
+      </w:r>
+      <w:r>
+        <w:rPr>
+          <w:rFonts w:asciiTheme="majorHAnsi" w:hAnsiTheme="majorHAnsi" w:cstheme="majorHAnsi"/>
+          <w:b/>
+        </w:rPr>
+        <w:t>Blue Yonder</w:t>
+      </w:r>
+      <w:r>
+        <w:rPr>
+          <w:rFonts w:asciiTheme="majorHAnsi" w:hAnsiTheme="majorHAnsi" w:cstheme="majorHAnsi"/>
+        </w:rPr>
+        <w:tab/>
+      </w:r>
+      <w:r>
+        <w:rPr>
+          <w:rFonts w:asciiTheme="majorHAnsi" w:hAnsiTheme="majorHAnsi" w:cstheme="majorHAnsi"/>
+          <w:b/>
+        </w:rPr>
+        <w:t>May 2015 – Mar 2016</w:t>
+      </w:r>
+    </w:p>
+    <w:p>
+      <w:pPr>
+        <w:tabs>
+          <w:tab w:val="left" w:pos="720"/>
+          <w:tab w:val="left" w:pos="-1007"/>
+          <w:tab w:val="left" w:pos="4395"/>
+          <w:tab w:val="right" w:pos="10197"/>
+          <w:tab w:val="center" w:pos="5097"/>
+          <w:tab w:val="left" w:pos="720"/>
+          <w:tab w:val="left" w:pos="1440"/>
+          <w:tab w:val="left" w:pos="2160"/>
+        </w:tabs>
+        <w:rPr>
+          <w:rFonts w:asciiTheme="majorHAnsi" w:hAnsiTheme="majorHAnsi" w:cstheme="majorHAnsi"/>
           <w:sz w:val="22"/>
           <w:szCs w:val="22"/>
         </w:rPr>
@@ -1258,6 +1335,20 @@
         <w:tab/>
         <w:t>Greater Milwaukee Area, WI</w:t>
       </w:r>
+    </w:p>
+    <w:p>
+      <w:pPr>
+        <w:tabs>
+          <w:tab w:val="left" w:pos="720"/>
+          <w:tab w:val="left" w:pos="1440"/>
+          <w:tab w:val="left" w:pos="2160"/>
+        </w:tabs>
+        <w:rPr>
+          <w:rFonts w:asciiTheme="majorHAnsi" w:hAnsiTheme="majorHAnsi" w:cstheme="majorHAnsi"/>
+          <w:sz w:val="22"/>
+          <w:szCs w:val="22"/>
+        </w:rPr>
+      </w:pPr>
     </w:p>
     <w:p>
       <w:pPr>
@@ -1401,6 +1492,7 @@
           <w:rFonts w:asciiTheme="minorHAnsi" w:eastAsia="Calibri" w:hAnsiTheme="minorHAnsi" w:cstheme="minorHAnsi"/>
           <w:bCs/>
         </w:rPr>
+        <w:lastRenderedPageBreak/>
         <w:t>Software Developer</w:t>
       </w:r>
       <w:r>
@@ -1436,8 +1528,8 @@
     <w:p>
       <w:pPr>
         <w:tabs>
+          <w:tab w:val="left" w:pos="720"/>
           <w:tab w:val="left" w:pos="-1007"/>
-          <w:tab w:val="left" w:pos="720"/>
           <w:tab w:val="left" w:pos="4395"/>
           <w:tab w:val="right" w:pos="10197"/>
           <w:tab w:val="center" w:pos="5097"/>
@@ -1476,6 +1568,21 @@
         <w:tab/>
         <w:t>Greater Milwaukee Area, WI</w:t>
       </w:r>
+    </w:p>
+    <w:p>
+      <w:pPr>
+        <w:pStyle w:val="ListParagraph"/>
+        <w:tabs>
+          <w:tab w:val="left" w:pos="720"/>
+          <w:tab w:val="left" w:pos="1440"/>
+          <w:tab w:val="left" w:pos="2160"/>
+        </w:tabs>
+        <w:rPr>
+          <w:rFonts w:asciiTheme="majorHAnsi" w:hAnsiTheme="majorHAnsi" w:cstheme="majorHAnsi"/>
+          <w:sz w:val="22"/>
+          <w:szCs w:val="22"/>
+        </w:rPr>
+      </w:pPr>
     </w:p>
     <w:p>
       <w:pPr>
@@ -1602,7 +1709,6 @@
           <w:rFonts w:asciiTheme="minorHAnsi" w:eastAsia="Calibri" w:hAnsiTheme="minorHAnsi" w:cstheme="minorHAnsi"/>
           <w:bCs/>
         </w:rPr>
-        <w:lastRenderedPageBreak/>
         <w:t>Technical Consultant Intermediate</w:t>
       </w:r>
       <w:r>
@@ -1636,8 +1742,8 @@
     <w:p>
       <w:pPr>
         <w:tabs>
+          <w:tab w:val="left" w:pos="720"/>
           <w:tab w:val="left" w:pos="-1007"/>
-          <w:tab w:val="left" w:pos="720"/>
           <w:tab w:val="left" w:pos="4395"/>
           <w:tab w:val="right" w:pos="10197"/>
           <w:tab w:val="center" w:pos="5097"/>
@@ -1676,6 +1782,20 @@
         <w:tab/>
         <w:t>Greater Milwaukee Area, WI</w:t>
       </w:r>
+    </w:p>
+    <w:p>
+      <w:pPr>
+        <w:tabs>
+          <w:tab w:val="left" w:pos="720"/>
+          <w:tab w:val="left" w:pos="1440"/>
+          <w:tab w:val="left" w:pos="2160"/>
+        </w:tabs>
+        <w:rPr>
+          <w:rFonts w:asciiTheme="majorHAnsi" w:hAnsiTheme="majorHAnsi" w:cstheme="majorHAnsi"/>
+          <w:sz w:val="22"/>
+          <w:szCs w:val="22"/>
+        </w:rPr>
+      </w:pPr>
     </w:p>
     <w:p>
       <w:pPr>
@@ -2041,8 +2161,8 @@
         </w:rPr>
         <w:t>2010</w:t>
       </w:r>
-      <w:bookmarkStart w:id="1" w:name="_icbh46l2ytt3" w:colFirst="0" w:colLast="0"/>
-      <w:bookmarkEnd w:id="1"/>
+      <w:bookmarkStart w:id="0" w:name="_icbh46l2ytt3" w:colFirst="0" w:colLast="0"/>
+      <w:bookmarkEnd w:id="0"/>
     </w:p>
     <w:sectPr>
       <w:footerReference w:type="default" r:id="rId11"/>

</xml_diff>

<commit_message>
Update Resume 5/9/2026 minor format issue
</commit_message>
<xml_diff>
--- a/documents/Michael Wester.docx
+++ b/documents/Michael Wester.docx
@@ -201,6 +201,76 @@
           <w:szCs w:val="22"/>
         </w:rPr>
       </w:pPr>
+      <w:r>
+        <w:rPr>
+          <w:rFonts w:asciiTheme="majorHAnsi" w:hAnsiTheme="majorHAnsi" w:cstheme="majorHAnsi"/>
+          <w:bCs/>
+          <w:color w:val="auto"/>
+          <w:sz w:val="22"/>
+          <w:szCs w:val="22"/>
+        </w:rPr>
+        <w:t xml:space="preserve">Senior Software Engineer and Technical Lead with 13+ years of experience building scalable </w:t>
+      </w:r>
+      <w:r>
+        <w:rPr>
+          <w:rFonts w:asciiTheme="majorHAnsi" w:hAnsiTheme="majorHAnsi" w:cstheme="majorHAnsi"/>
+          <w:bCs/>
+          <w:color w:val="auto"/>
+          <w:sz w:val="22"/>
+          <w:szCs w:val="22"/>
+        </w:rPr>
+        <w:t xml:space="preserve">systems and </w:t>
+      </w:r>
+      <w:r>
+        <w:rPr>
+          <w:rFonts w:asciiTheme="majorHAnsi" w:hAnsiTheme="majorHAnsi" w:cstheme="majorHAnsi"/>
+          <w:bCs/>
+          <w:color w:val="auto"/>
+          <w:sz w:val="22"/>
+          <w:szCs w:val="22"/>
+        </w:rPr>
+        <w:t xml:space="preserve">full-stack </w:t>
+      </w:r>
+      <w:r>
+        <w:rPr>
+          <w:rFonts w:asciiTheme="majorHAnsi" w:hAnsiTheme="majorHAnsi" w:cstheme="majorHAnsi"/>
+          <w:bCs/>
+          <w:color w:val="auto"/>
+          <w:sz w:val="22"/>
+          <w:szCs w:val="22"/>
+        </w:rPr>
+        <w:t xml:space="preserve">enterprise </w:t>
+      </w:r>
+      <w:r>
+        <w:rPr>
+          <w:rFonts w:asciiTheme="majorHAnsi" w:hAnsiTheme="majorHAnsi" w:cstheme="majorHAnsi"/>
+          <w:bCs/>
+          <w:color w:val="auto"/>
+          <w:sz w:val="22"/>
+          <w:szCs w:val="22"/>
+        </w:rPr>
+        <w:t>applications, microservices, SPAs, and cloud-native platforms. Expertise in C#, ASP.</w:t>
+      </w:r>
+      <w:r>
+        <w:rPr>
+          <w:rFonts w:asciiTheme="majorHAnsi" w:hAnsiTheme="majorHAnsi" w:cstheme="majorHAnsi"/>
+          <w:bCs/>
+          <w:color w:val="auto"/>
+          <w:sz w:val="22"/>
+          <w:szCs w:val="22"/>
+        </w:rPr>
+        <w:t>Net</w:t>
+      </w:r>
+      <w:r>
+        <w:rPr>
+          <w:rFonts w:asciiTheme="majorHAnsi" w:hAnsiTheme="majorHAnsi" w:cstheme="majorHAnsi"/>
+          <w:bCs/>
+          <w:color w:val="auto"/>
+          <w:sz w:val="22"/>
+          <w:szCs w:val="22"/>
+        </w:rPr>
+        <w:t>, Angular, TypeScript, REST APIs, Azure, and modern frontend architecture. Proven track record leading engineering teams, modernizing platforms, improving developer productivity, and delivering customer-focused solutions in fast-paced environments.</w:t>
+      </w:r>
     </w:p>
     <w:p>
       <w:pPr>
@@ -212,70 +282,87 @@
           <w:right w:val="nil"/>
           <w:between w:val="nil"/>
         </w:pBdr>
-        <w:spacing w:line="276" w:lineRule="auto"/>
-        <w:rPr>
-          <w:rFonts w:asciiTheme="majorHAnsi" w:hAnsiTheme="majorHAnsi" w:cstheme="majorHAnsi"/>
-          <w:bCs/>
-          <w:color w:val="auto"/>
-          <w:sz w:val="22"/>
-          <w:szCs w:val="22"/>
-        </w:rPr>
-      </w:pPr>
-      <w:r>
-        <w:rPr>
-          <w:rFonts w:asciiTheme="majorHAnsi" w:hAnsiTheme="majorHAnsi" w:cstheme="majorHAnsi"/>
-          <w:bCs/>
-          <w:color w:val="auto"/>
-          <w:sz w:val="22"/>
-          <w:szCs w:val="22"/>
-        </w:rPr>
-        <w:t xml:space="preserve">Senior Software Engineer and Technical Lead with 13+ years of experience building scalable </w:t>
-      </w:r>
-      <w:r>
-        <w:rPr>
-          <w:rFonts w:asciiTheme="majorHAnsi" w:hAnsiTheme="majorHAnsi" w:cstheme="majorHAnsi"/>
-          <w:bCs/>
-          <w:color w:val="auto"/>
-          <w:sz w:val="22"/>
-          <w:szCs w:val="22"/>
-        </w:rPr>
-        <w:t xml:space="preserve">systems and </w:t>
-      </w:r>
-      <w:r>
-        <w:rPr>
-          <w:rFonts w:asciiTheme="majorHAnsi" w:hAnsiTheme="majorHAnsi" w:cstheme="majorHAnsi"/>
-          <w:bCs/>
-          <w:color w:val="auto"/>
-          <w:sz w:val="22"/>
-          <w:szCs w:val="22"/>
-        </w:rPr>
-        <w:t xml:space="preserve">full-stack </w:t>
-      </w:r>
-      <w:r>
-        <w:rPr>
-          <w:rFonts w:asciiTheme="majorHAnsi" w:hAnsiTheme="majorHAnsi" w:cstheme="majorHAnsi"/>
-          <w:bCs/>
-          <w:color w:val="auto"/>
-          <w:sz w:val="22"/>
-          <w:szCs w:val="22"/>
-        </w:rPr>
-        <w:t xml:space="preserve">enterprise </w:t>
-      </w:r>
-      <w:r>
-        <w:rPr>
-          <w:rFonts w:asciiTheme="majorHAnsi" w:hAnsiTheme="majorHAnsi" w:cstheme="majorHAnsi"/>
-          <w:bCs/>
-          <w:color w:val="auto"/>
-          <w:sz w:val="22"/>
-          <w:szCs w:val="22"/>
-        </w:rPr>
-        <w:t>applications, microservices, SPAs, and cloud-native platforms. Expertise in C#, ASP.</w:t>
-      </w:r>
-      <w:r>
-        <w:rPr>
-          <w:rFonts w:asciiTheme="majorHAnsi" w:hAnsiTheme="majorHAnsi" w:cstheme="majorHAnsi"/>
-          <w:bCs/>
-          <w:color w:val="auto"/>
+        <w:rPr>
+          <w:rFonts w:asciiTheme="majorHAnsi" w:hAnsiTheme="majorHAnsi" w:cstheme="majorHAnsi"/>
+          <w:color w:val="1155CC"/>
+        </w:rPr>
+      </w:pPr>
+      <w:r>
+        <w:rPr>
+          <w:rFonts w:asciiTheme="majorHAnsi" w:hAnsiTheme="majorHAnsi" w:cstheme="majorHAnsi"/>
+          <w:color w:val="1155CC"/>
+        </w:rPr>
+        <w:t>Technologies and Languages</w:t>
+      </w:r>
+    </w:p>
+    <w:p>
+      <w:pPr>
+        <w:numPr>
+          <w:ilvl w:val="0"/>
+          <w:numId w:val="2"/>
+        </w:numPr>
+      </w:pPr>
+      <w:r>
+        <w:rPr>
+          <w:rFonts w:asciiTheme="minorHAnsi" w:hAnsiTheme="minorHAnsi"/>
+          <w:sz w:val="22"/>
+          <w:szCs w:val="22"/>
+        </w:rPr>
+        <w:t>Languages: C#, TypeScript, JavaScript, SQL, HTML5, CSS3</w:t>
+      </w:r>
+    </w:p>
+    <w:p>
+      <w:pPr>
+        <w:numPr>
+          <w:ilvl w:val="0"/>
+          <w:numId w:val="2"/>
+        </w:numPr>
+      </w:pPr>
+      <w:r>
+        <w:rPr>
+          <w:rFonts w:asciiTheme="minorHAnsi" w:hAnsiTheme="minorHAnsi"/>
+          <w:sz w:val="22"/>
+          <w:szCs w:val="22"/>
+        </w:rPr>
+        <w:t xml:space="preserve">Frontend: Angular, React, </w:t>
+      </w:r>
+      <w:proofErr w:type="spellStart"/>
+      <w:r>
+        <w:rPr>
+          <w:rFonts w:asciiTheme="minorHAnsi" w:hAnsiTheme="minorHAnsi"/>
+          <w:sz w:val="22"/>
+          <w:szCs w:val="22"/>
+        </w:rPr>
+        <w:t>RxJS</w:t>
+      </w:r>
+      <w:proofErr w:type="spellEnd"/>
+      <w:r>
+        <w:rPr>
+          <w:rFonts w:asciiTheme="minorHAnsi" w:hAnsiTheme="minorHAnsi"/>
+          <w:sz w:val="22"/>
+          <w:szCs w:val="22"/>
+        </w:rPr>
+        <w:t>, Angular Material, AG Grid, Jest, Jasmine</w:t>
+      </w:r>
+    </w:p>
+    <w:p>
+      <w:pPr>
+        <w:numPr>
+          <w:ilvl w:val="0"/>
+          <w:numId w:val="2"/>
+        </w:numPr>
+      </w:pPr>
+      <w:r>
+        <w:rPr>
+          <w:rFonts w:asciiTheme="minorHAnsi" w:hAnsiTheme="minorHAnsi"/>
+          <w:sz w:val="22"/>
+          <w:szCs w:val="22"/>
+        </w:rPr>
+        <w:t>Backend: ASP.</w:t>
+      </w:r>
+      <w:r>
+        <w:rPr>
+          <w:rFonts w:asciiTheme="minorHAnsi" w:hAnsiTheme="minorHAnsi"/>
           <w:sz w:val="22"/>
           <w:szCs w:val="22"/>
         </w:rPr>
@@ -283,13 +370,134 @@
       </w:r>
       <w:r>
         <w:rPr>
-          <w:rFonts w:asciiTheme="majorHAnsi" w:hAnsiTheme="majorHAnsi" w:cstheme="majorHAnsi"/>
-          <w:bCs/>
-          <w:color w:val="auto"/>
-          <w:sz w:val="22"/>
-          <w:szCs w:val="22"/>
-        </w:rPr>
-        <w:t>, Angular, TypeScript, REST APIs, Azure, and modern frontend architecture. Proven track record leading engineering teams, modernizing platforms, improving developer productivity, and delivering customer-focused solutions in fast-paced environments.</w:t>
+          <w:rFonts w:asciiTheme="minorHAnsi" w:hAnsiTheme="minorHAnsi"/>
+          <w:sz w:val="22"/>
+          <w:szCs w:val="22"/>
+        </w:rPr>
+        <w:t xml:space="preserve"> Core, REST APIs, </w:t>
+      </w:r>
+      <w:proofErr w:type="spellStart"/>
+      <w:r>
+        <w:rPr>
+          <w:rFonts w:asciiTheme="minorHAnsi" w:hAnsiTheme="minorHAnsi"/>
+          <w:sz w:val="22"/>
+          <w:szCs w:val="22"/>
+        </w:rPr>
+        <w:t>GraphQL</w:t>
+      </w:r>
+      <w:proofErr w:type="spellEnd"/>
+      <w:r>
+        <w:rPr>
+          <w:rFonts w:asciiTheme="minorHAnsi" w:hAnsiTheme="minorHAnsi"/>
+          <w:sz w:val="22"/>
+          <w:szCs w:val="22"/>
+        </w:rPr>
+        <w:t>, Entity Framework, Microservices</w:t>
+      </w:r>
+    </w:p>
+    <w:p>
+      <w:pPr>
+        <w:numPr>
+          <w:ilvl w:val="0"/>
+          <w:numId w:val="2"/>
+        </w:numPr>
+      </w:pPr>
+      <w:r>
+        <w:rPr>
+          <w:rFonts w:asciiTheme="minorHAnsi" w:hAnsiTheme="minorHAnsi"/>
+          <w:sz w:val="22"/>
+          <w:szCs w:val="22"/>
+        </w:rPr>
+        <w:t xml:space="preserve">Cloud &amp; DevOps: </w:t>
+      </w:r>
+      <w:r>
+        <w:t xml:space="preserve">Azure, Azure DevOps, AWS, Docker, Kubernetes, GitHub Actions, Azure Pipelines, Jenkins, </w:t>
+      </w:r>
+      <w:proofErr w:type="spellStart"/>
+      <w:r>
+        <w:t>CircleCI</w:t>
+      </w:r>
+      <w:proofErr w:type="spellEnd"/>
+      <w:r>
+        <w:t xml:space="preserve">, Octopus </w:t>
+      </w:r>
+      <w:proofErr w:type="spellStart"/>
+      <w:r>
+        <w:t>Deploy</w:t>
+      </w:r>
+    </w:p>
+    <w:p>
+      <w:pPr>
+        <w:numPr>
+          <w:ilvl w:val="0"/>
+          <w:numId w:val="2"/>
+        </w:numPr>
+      </w:pPr>
+      <w:r>
+        <w:rPr>
+          <w:rFonts w:asciiTheme="minorHAnsi" w:hAnsiTheme="minorHAnsi"/>
+          <w:sz w:val="22"/>
+          <w:szCs w:val="22"/>
+        </w:rPr>
+        <w:t>Database</w:t>
+      </w:r>
+      <w:proofErr w:type="spellEnd"/>
+      <w:r>
+        <w:rPr>
+          <w:rFonts w:asciiTheme="minorHAnsi" w:hAnsiTheme="minorHAnsi"/>
+          <w:sz w:val="22"/>
+          <w:szCs w:val="22"/>
+        </w:rPr>
+        <w:t>s: SQL Server, PostgreSQL, MongoDB, Oracle, Azure SQL</w:t>
+      </w:r>
+    </w:p>
+    <w:p>
+      <w:pPr>
+        <w:numPr>
+          <w:ilvl w:val="0"/>
+          <w:numId w:val="2"/>
+        </w:numPr>
+      </w:pPr>
+      <w:r>
+        <w:rPr>
+          <w:rFonts w:asciiTheme="minorHAnsi" w:hAnsiTheme="minorHAnsi"/>
+          <w:sz w:val="22"/>
+          <w:szCs w:val="22"/>
+        </w:rPr>
+        <w:t>Architecture: SPA/PWA, Microservices, CI/CD, API Design, Distributed</w:t>
+      </w:r>
+      <w:r>
+        <w:rPr>
+          <w:rFonts w:asciiTheme="minorHAnsi" w:hAnsiTheme="minorHAnsi"/>
+          <w:sz w:val="22"/>
+          <w:szCs w:val="22"/>
+        </w:rPr>
+        <w:t xml:space="preserve">, </w:t>
+      </w:r>
+      <w:r>
+        <w:t>Event-</w:t>
+      </w:r>
+      <w:r>
+        <w:t>D</w:t>
+      </w:r>
+      <w:r>
+        <w:t>riven architecture</w:t>
+      </w:r>
+    </w:p>
+    <w:p>
+      <w:pPr>
+        <w:numPr>
+          <w:ilvl w:val="0"/>
+          <w:numId w:val="2"/>
+        </w:numPr>
+      </w:pPr>
+      <w:r>
+        <w:rPr>
+          <w:rFonts w:asciiTheme="minorHAnsi" w:hAnsiTheme="minorHAnsi"/>
+          <w:sz w:val="22"/>
+          <w:szCs w:val="22"/>
+        </w:rPr>
+        <w:t>Security: OAuth, OpenID Connect, SSO</w:t>
       </w:r>
     </w:p>
     <w:p>
@@ -312,234 +520,6 @@
           <w:rFonts w:asciiTheme="majorHAnsi" w:hAnsiTheme="majorHAnsi" w:cstheme="majorHAnsi"/>
           <w:color w:val="1155CC"/>
         </w:rPr>
-        <w:t>Technologies and Languages</w:t>
-      </w:r>
-    </w:p>
-    <w:p>
-      <w:pPr>
-        <w:numPr>
-          <w:ilvl w:val="0"/>
-          <w:numId w:val="2"/>
-        </w:numPr>
-      </w:pPr>
-      <w:r>
-        <w:rPr>
-          <w:rFonts w:asciiTheme="minorHAnsi" w:hAnsiTheme="minorHAnsi"/>
-          <w:sz w:val="22"/>
-          <w:szCs w:val="22"/>
-        </w:rPr>
-        <w:t>Languages: C#, TypeScript, JavaScript, SQL, HTML5, CSS3</w:t>
-      </w:r>
-    </w:p>
-    <w:p>
-      <w:pPr>
-        <w:numPr>
-          <w:ilvl w:val="0"/>
-          <w:numId w:val="2"/>
-        </w:numPr>
-      </w:pPr>
-      <w:r>
-        <w:rPr>
-          <w:rFonts w:asciiTheme="minorHAnsi" w:hAnsiTheme="minorHAnsi"/>
-          <w:sz w:val="22"/>
-          <w:szCs w:val="22"/>
-        </w:rPr>
-        <w:t xml:space="preserve">Frontend: Angular, React, </w:t>
-      </w:r>
-      <w:proofErr w:type="spellStart"/>
-      <w:r>
-        <w:rPr>
-          <w:rFonts w:asciiTheme="minorHAnsi" w:hAnsiTheme="minorHAnsi"/>
-          <w:sz w:val="22"/>
-          <w:szCs w:val="22"/>
-        </w:rPr>
-        <w:t>RxJS</w:t>
-      </w:r>
-      <w:proofErr w:type="spellEnd"/>
-      <w:r>
-        <w:rPr>
-          <w:rFonts w:asciiTheme="minorHAnsi" w:hAnsiTheme="minorHAnsi"/>
-          <w:sz w:val="22"/>
-          <w:szCs w:val="22"/>
-        </w:rPr>
-        <w:t>, Angular Material, AG Grid, Jest, Jasmine</w:t>
-      </w:r>
-    </w:p>
-    <w:p>
-      <w:pPr>
-        <w:numPr>
-          <w:ilvl w:val="0"/>
-          <w:numId w:val="2"/>
-        </w:numPr>
-      </w:pPr>
-      <w:r>
-        <w:rPr>
-          <w:rFonts w:asciiTheme="minorHAnsi" w:hAnsiTheme="minorHAnsi"/>
-          <w:sz w:val="22"/>
-          <w:szCs w:val="22"/>
-        </w:rPr>
-        <w:t>Backend: ASP.</w:t>
-      </w:r>
-      <w:r>
-        <w:rPr>
-          <w:rFonts w:asciiTheme="minorHAnsi" w:hAnsiTheme="minorHAnsi"/>
-          <w:sz w:val="22"/>
-          <w:szCs w:val="22"/>
-        </w:rPr>
-        <w:t>Net</w:t>
-      </w:r>
-      <w:r>
-        <w:rPr>
-          <w:rFonts w:asciiTheme="minorHAnsi" w:hAnsiTheme="minorHAnsi"/>
-          <w:sz w:val="22"/>
-          <w:szCs w:val="22"/>
-        </w:rPr>
-        <w:t xml:space="preserve"> Core, REST APIs, </w:t>
-      </w:r>
-      <w:proofErr w:type="spellStart"/>
-      <w:r>
-        <w:rPr>
-          <w:rFonts w:asciiTheme="minorHAnsi" w:hAnsiTheme="minorHAnsi"/>
-          <w:sz w:val="22"/>
-          <w:szCs w:val="22"/>
-        </w:rPr>
-        <w:t>GraphQL</w:t>
-      </w:r>
-      <w:proofErr w:type="spellEnd"/>
-      <w:r>
-        <w:rPr>
-          <w:rFonts w:asciiTheme="minorHAnsi" w:hAnsiTheme="minorHAnsi"/>
-          <w:sz w:val="22"/>
-          <w:szCs w:val="22"/>
-        </w:rPr>
-        <w:t>, Entity Framework, Microservices</w:t>
-      </w:r>
-    </w:p>
-    <w:p>
-      <w:pPr>
-        <w:numPr>
-          <w:ilvl w:val="0"/>
-          <w:numId w:val="2"/>
-        </w:numPr>
-      </w:pPr>
-      <w:r>
-        <w:rPr>
-          <w:rFonts w:asciiTheme="minorHAnsi" w:hAnsiTheme="minorHAnsi"/>
-          <w:sz w:val="22"/>
-          <w:szCs w:val="22"/>
-        </w:rPr>
-        <w:t xml:space="preserve">Cloud &amp; DevOps: </w:t>
-      </w:r>
-      <w:r>
-        <w:t xml:space="preserve">Azure, Azure DevOps, AWS, Docker, Kubernetes, GitHub Actions, Azure Pipelines, Jenkins, </w:t>
-      </w:r>
-      <w:proofErr w:type="spellStart"/>
-      <w:r>
-        <w:t>CircleCI</w:t>
-      </w:r>
-      <w:proofErr w:type="spellEnd"/>
-      <w:r>
-        <w:t xml:space="preserve">, Octopus </w:t>
-      </w:r>
-      <w:proofErr w:type="spellStart"/>
-      <w:r>
-        <w:t>Deploy</w:t>
-      </w:r>
-    </w:p>
-    <w:p>
-      <w:pPr>
-        <w:numPr>
-          <w:ilvl w:val="0"/>
-          <w:numId w:val="2"/>
-        </w:numPr>
-      </w:pPr>
-      <w:r>
-        <w:rPr>
-          <w:rFonts w:asciiTheme="minorHAnsi" w:hAnsiTheme="minorHAnsi"/>
-          <w:sz w:val="22"/>
-          <w:szCs w:val="22"/>
-        </w:rPr>
-        <w:t>Database</w:t>
-      </w:r>
-      <w:proofErr w:type="spellEnd"/>
-      <w:r>
-        <w:rPr>
-          <w:rFonts w:asciiTheme="minorHAnsi" w:hAnsiTheme="minorHAnsi"/>
-          <w:sz w:val="22"/>
-          <w:szCs w:val="22"/>
-        </w:rPr>
-        <w:t>s: SQL Server, PostgreSQL, MongoDB, Oracle, Azure SQL</w:t>
-      </w:r>
-    </w:p>
-    <w:p>
-      <w:pPr>
-        <w:numPr>
-          <w:ilvl w:val="0"/>
-          <w:numId w:val="2"/>
-        </w:numPr>
-      </w:pPr>
-      <w:r>
-        <w:rPr>
-          <w:rFonts w:asciiTheme="minorHAnsi" w:hAnsiTheme="minorHAnsi"/>
-          <w:sz w:val="22"/>
-          <w:szCs w:val="22"/>
-        </w:rPr>
-        <w:t>Architecture: SPA/PWA, Microservices, CI/CD, API Design, Distributed</w:t>
-      </w:r>
-      <w:r>
-        <w:rPr>
-          <w:rFonts w:asciiTheme="minorHAnsi" w:hAnsiTheme="minorHAnsi"/>
-          <w:sz w:val="22"/>
-          <w:szCs w:val="22"/>
-        </w:rPr>
-        <w:t xml:space="preserve">, </w:t>
-      </w:r>
-      <w:r>
-        <w:t>Event-</w:t>
-      </w:r>
-      <w:r>
-        <w:t>D</w:t>
-      </w:r>
-      <w:r>
-        <w:t>riven architecture</w:t>
-      </w:r>
-    </w:p>
-    <w:p>
-      <w:pPr>
-        <w:numPr>
-          <w:ilvl w:val="0"/>
-          <w:numId w:val="2"/>
-        </w:numPr>
-      </w:pPr>
-      <w:r>
-        <w:rPr>
-          <w:rFonts w:asciiTheme="minorHAnsi" w:hAnsiTheme="minorHAnsi"/>
-          <w:sz w:val="22"/>
-          <w:szCs w:val="22"/>
-        </w:rPr>
-        <w:t>Security: OAuth, OpenID Connect, SSO</w:t>
-      </w:r>
-    </w:p>
-    <w:p>
-      <w:pPr>
-        <w:pStyle w:val="Heading2"/>
-        <w:pBdr>
-          <w:top w:val="nil"/>
-          <w:left w:val="nil"/>
-          <w:bottom w:val="single" w:sz="8" w:space="2" w:color="1155CC"/>
-          <w:right w:val="nil"/>
-          <w:between w:val="nil"/>
-        </w:pBdr>
-        <w:rPr>
-          <w:rFonts w:asciiTheme="majorHAnsi" w:hAnsiTheme="majorHAnsi" w:cstheme="majorHAnsi"/>
-          <w:color w:val="1155CC"/>
-        </w:rPr>
-      </w:pPr>
-      <w:r>
-        <w:rPr>
-          <w:rFonts w:asciiTheme="majorHAnsi" w:hAnsiTheme="majorHAnsi" w:cstheme="majorHAnsi"/>
-          <w:color w:val="1155CC"/>
-        </w:rPr>
         <w:t>Work Experience</w:t>
       </w:r>
     </w:p>
@@ -1279,8 +1259,7 @@
           <w:sz w:val="22"/>
           <w:szCs w:val="22"/>
         </w:rPr>
-        <w:lastRenderedPageBreak/>
-        <w:t>· Integrated Azure Service Bus into a microservices architecture, improving system communication and scalability.</w:t>
+        <w:t>Integrated Azure Service Bus into a microservices architecture, improving system communication and scalability.</w:t>
       </w:r>
     </w:p>
     <w:p>

</xml_diff>